<commit_message>
Add/update fra data for UWTranslationNotes
</commit_message>
<xml_diff>
--- a/fra/docx/08.content.docx
+++ b/fra/docx/08.content.docx
@@ -6658,13 +6658,7 @@
         <w:rPr>
           <w:lang w:val="fr_FR" w:bidi="fr_FR"/>
         </w:rPr>
-        <w:t xml:space="preserve">Voir : </w:t>
-      </w:r>
-      <w:r>
-        <w:rPr>
-          <w:lang w:val="fr_FR" w:bidi="fr_FR"/>
-        </w:rPr>
-        <w:t>Serments</w:t>
+        <w:t>Voir : Serments</w:t>
       </w:r>
       <w:r>
         <w:rPr>
@@ -13051,13 +13045,7 @@
         <w:rPr>
           <w:lang w:val="fr_FR" w:bidi="fr_FR"/>
         </w:rPr>
-        <w:t xml:space="preserve">Voir : </w:t>
-      </w:r>
-      <w:r>
-        <w:rPr>
-          <w:lang w:val="fr_FR" w:bidi="fr_FR"/>
-        </w:rPr>
-        <w:t>Reduplication</w:t>
+        <w:t>Voir : Reduplication</w:t>
       </w:r>
       <w:r>
         <w:rPr>
@@ -23443,13 +23431,7 @@
         <w:rPr>
           <w:lang w:val="fr_FR" w:bidi="fr_FR"/>
         </w:rPr>
-        <w:t xml:space="preserve">Voir : </w:t>
-      </w:r>
-      <w:r>
-        <w:rPr>
-          <w:lang w:val="fr_FR" w:bidi="fr_FR"/>
-        </w:rPr>
-        <w:t>Formules de serment</w:t>
+        <w:t>Voir : Formules de serment</w:t>
       </w:r>
       <w:r>
         <w:rPr>

</xml_diff>